<commit_message>
uml angepasst und docstrings verbessert
</commit_message>
<xml_diff>
--- a/Entwicklerdoku.docx
+++ b/Entwicklerdoku.docx
@@ -4,7 +4,7 @@
   <w:body>
     <w:p>
       <w:pPr>
-        <w:pStyle w:val="Heading2"/>
+        <w:pStyle w:val="berschrift2"/>
         <w:rPr>
           <w:rFonts w:asciiTheme="minorHAnsi" w:hAnsiTheme="minorHAnsi" w:cstheme="minorHAnsi"/>
         </w:rPr>
@@ -18,7 +18,7 @@
     </w:p>
     <w:p>
       <w:pPr>
-        <w:pStyle w:val="Heading3"/>
+        <w:pStyle w:val="berschrift3"/>
         <w:shd w:val="clear" w:color="auto" w:fill="FFFFFF"/>
         <w:rPr>
           <w:rFonts w:asciiTheme="minorHAnsi" w:hAnsiTheme="minorHAnsi" w:cstheme="minorHAnsi"/>
@@ -56,7 +56,7 @@
       </w:pPr>
       <w:r>
         <w:rPr>
-          <w:rStyle w:val="Strong"/>
+          <w:rStyle w:val="Fett"/>
           <w:rFonts w:cstheme="minorHAnsi"/>
           <w:color w:val="1F2328"/>
         </w:rPr>
@@ -85,7 +85,7 @@
       </w:pPr>
       <w:r>
         <w:rPr>
-          <w:rStyle w:val="Strong"/>
+          <w:rStyle w:val="Fett"/>
           <w:rFonts w:cstheme="minorHAnsi"/>
           <w:color w:val="1F2328"/>
         </w:rPr>
@@ -114,7 +114,7 @@
       </w:pPr>
       <w:r>
         <w:rPr>
-          <w:rStyle w:val="Strong"/>
+          <w:rStyle w:val="Fett"/>
           <w:rFonts w:cstheme="minorHAnsi"/>
           <w:color w:val="1F2328"/>
         </w:rPr>
@@ -130,7 +130,7 @@
     </w:p>
     <w:p>
       <w:pPr>
-        <w:pStyle w:val="Heading3"/>
+        <w:pStyle w:val="berschrift3"/>
         <w:shd w:val="clear" w:color="auto" w:fill="FFFFFF"/>
         <w:rPr>
           <w:rFonts w:asciiTheme="minorHAnsi" w:hAnsiTheme="minorHAnsi" w:cstheme="minorHAnsi"/>
@@ -155,7 +155,7 @@
     </w:p>
     <w:p>
       <w:pPr>
-        <w:pStyle w:val="NormalWeb"/>
+        <w:pStyle w:val="StandardWeb"/>
         <w:numPr>
           <w:ilvl w:val="0"/>
           <w:numId w:val="5"/>
@@ -170,7 +170,7 @@
       </w:pPr>
       <w:r>
         <w:rPr>
-          <w:rStyle w:val="Strong"/>
+          <w:rStyle w:val="Fett"/>
           <w:rFonts w:asciiTheme="minorHAnsi" w:hAnsiTheme="minorHAnsi" w:cstheme="minorHAnsi"/>
           <w:color w:val="1F2328"/>
           <w:sz w:val="22"/>
@@ -203,7 +203,7 @@
       </w:pPr>
       <w:r>
         <w:rPr>
-          <w:rStyle w:val="Strong"/>
+          <w:rStyle w:val="Fett"/>
           <w:rFonts w:cstheme="minorHAnsi"/>
           <w:color w:val="1F2328"/>
         </w:rPr>
@@ -232,7 +232,7 @@
       </w:pPr>
       <w:r>
         <w:rPr>
-          <w:rStyle w:val="Strong"/>
+          <w:rStyle w:val="Fett"/>
           <w:rFonts w:cstheme="minorHAnsi"/>
           <w:color w:val="1F2328"/>
         </w:rPr>
@@ -262,7 +262,7 @@
     </w:p>
     <w:p>
       <w:pPr>
-        <w:pStyle w:val="NormalWeb"/>
+        <w:pStyle w:val="StandardWeb"/>
         <w:numPr>
           <w:ilvl w:val="0"/>
           <w:numId w:val="5"/>
@@ -278,7 +278,7 @@
       </w:pPr>
       <w:r>
         <w:rPr>
-          <w:rStyle w:val="Strong"/>
+          <w:rStyle w:val="Fett"/>
           <w:rFonts w:asciiTheme="minorHAnsi" w:hAnsiTheme="minorHAnsi" w:cstheme="minorHAnsi"/>
           <w:color w:val="1F2328"/>
           <w:sz w:val="22"/>
@@ -330,7 +330,7 @@
       </w:pPr>
       <w:r>
         <w:rPr>
-          <w:rStyle w:val="Strong"/>
+          <w:rStyle w:val="Fett"/>
           <w:rFonts w:cstheme="minorHAnsi"/>
           <w:color w:val="1F2328"/>
         </w:rPr>
@@ -359,7 +359,7 @@
       </w:pPr>
       <w:r>
         <w:rPr>
-          <w:rStyle w:val="Strong"/>
+          <w:rStyle w:val="Fett"/>
           <w:rFonts w:cstheme="minorHAnsi"/>
           <w:color w:val="1F2328"/>
         </w:rPr>
@@ -375,7 +375,7 @@
     </w:p>
     <w:p>
       <w:pPr>
-        <w:pStyle w:val="NormalWeb"/>
+        <w:pStyle w:val="StandardWeb"/>
         <w:numPr>
           <w:ilvl w:val="0"/>
           <w:numId w:val="5"/>
@@ -390,7 +390,7 @@
       </w:pPr>
       <w:r>
         <w:rPr>
-          <w:rStyle w:val="Strong"/>
+          <w:rStyle w:val="Fett"/>
           <w:rFonts w:asciiTheme="minorHAnsi" w:hAnsiTheme="minorHAnsi" w:cstheme="minorHAnsi"/>
           <w:color w:val="1F2328"/>
           <w:sz w:val="22"/>
@@ -423,7 +423,7 @@
       </w:pPr>
       <w:r>
         <w:rPr>
-          <w:rStyle w:val="Strong"/>
+          <w:rStyle w:val="Fett"/>
           <w:rFonts w:cstheme="minorHAnsi"/>
           <w:color w:val="1F2328"/>
         </w:rPr>
@@ -452,7 +452,7 @@
       </w:pPr>
       <w:r>
         <w:rPr>
-          <w:rStyle w:val="Strong"/>
+          <w:rStyle w:val="Fett"/>
           <w:rFonts w:cstheme="minorHAnsi"/>
           <w:color w:val="1F2328"/>
         </w:rPr>
@@ -498,7 +498,7 @@
     </w:p>
     <w:p>
       <w:pPr>
-        <w:pStyle w:val="NormalWeb"/>
+        <w:pStyle w:val="StandardWeb"/>
         <w:numPr>
           <w:ilvl w:val="0"/>
           <w:numId w:val="5"/>
@@ -513,7 +513,7 @@
       </w:pPr>
       <w:r>
         <w:rPr>
-          <w:rStyle w:val="Strong"/>
+          <w:rStyle w:val="Fett"/>
           <w:rFonts w:asciiTheme="minorHAnsi" w:hAnsiTheme="minorHAnsi" w:cstheme="minorHAnsi"/>
           <w:color w:val="1F2328"/>
           <w:sz w:val="22"/>
@@ -546,7 +546,7 @@
       </w:pPr>
       <w:r>
         <w:rPr>
-          <w:rStyle w:val="Strong"/>
+          <w:rStyle w:val="Fett"/>
           <w:rFonts w:cstheme="minorHAnsi"/>
           <w:color w:val="1F2328"/>
         </w:rPr>
@@ -575,7 +575,7 @@
       </w:pPr>
       <w:r>
         <w:rPr>
-          <w:rStyle w:val="Strong"/>
+          <w:rStyle w:val="Fett"/>
           <w:rFonts w:cstheme="minorHAnsi"/>
           <w:color w:val="1F2328"/>
         </w:rPr>
@@ -605,7 +605,7 @@
     </w:p>
     <w:p>
       <w:pPr>
-        <w:pStyle w:val="Heading3"/>
+        <w:pStyle w:val="berschrift3"/>
         <w:shd w:val="clear" w:color="auto" w:fill="FFFFFF"/>
         <w:rPr>
           <w:rFonts w:asciiTheme="minorHAnsi" w:hAnsiTheme="minorHAnsi" w:cstheme="minorHAnsi"/>
@@ -630,7 +630,7 @@
     </w:p>
     <w:p>
       <w:pPr>
-        <w:pStyle w:val="NormalWeb"/>
+        <w:pStyle w:val="StandardWeb"/>
         <w:shd w:val="clear" w:color="auto" w:fill="FFFFFF"/>
         <w:spacing w:before="0" w:beforeAutospacing="0"/>
         <w:rPr>
@@ -652,7 +652,7 @@
     </w:p>
     <w:p>
       <w:pPr>
-        <w:pStyle w:val="Heading2"/>
+        <w:pStyle w:val="berschrift2"/>
         <w:rPr>
           <w:rFonts w:asciiTheme="minorHAnsi" w:hAnsiTheme="minorHAnsi" w:cstheme="minorHAnsi"/>
         </w:rPr>
@@ -667,15 +667,11 @@
     </w:p>
     <w:p>
       <w:r>
-        <w:rPr>
-          <w:noProof/>
-          <w:lang w:eastAsia="de-DE"/>
-        </w:rPr>
         <w:drawing>
-          <wp:inline distT="0" distB="0" distL="0" distR="0" wp14:anchorId="643129FB" wp14:editId="09D7B31B">
-            <wp:extent cx="5690681" cy="3779360"/>
-            <wp:effectExtent l="0" t="0" r="0" b="5715"/>
-            <wp:docPr id="1" name="Grafik 1"/>
+          <wp:inline distT="0" distB="0" distL="0" distR="0" wp14:anchorId="397B43DB" wp14:editId="35F600B3">
+            <wp:extent cx="5760720" cy="5680075"/>
+            <wp:effectExtent l="0" t="0" r="0" b="0"/>
+            <wp:docPr id="202225086" name="Grafik 1"/>
             <wp:cNvGraphicFramePr>
               <a:graphicFrameLocks xmlns:a="http://schemas.openxmlformats.org/drawingml/2006/main" noChangeAspect="1"/>
             </wp:cNvGraphicFramePr>
@@ -683,7 +679,7 @@
               <a:graphicData uri="http://schemas.openxmlformats.org/drawingml/2006/picture">
                 <pic:pic xmlns:pic="http://schemas.openxmlformats.org/drawingml/2006/picture">
                   <pic:nvPicPr>
-                    <pic:cNvPr id="1" name=""/>
+                    <pic:cNvPr id="202225086" name=""/>
                     <pic:cNvPicPr/>
                   </pic:nvPicPr>
                   <pic:blipFill>
@@ -695,7 +691,7 @@
                   <pic:spPr>
                     <a:xfrm>
                       <a:off x="0" y="0"/>
-                      <a:ext cx="5710124" cy="3792273"/>
+                      <a:ext cx="5760720" cy="5680075"/>
                     </a:xfrm>
                     <a:prstGeom prst="rect">
                       <a:avLst/>
@@ -709,8 +705,13 @@
       </w:r>
     </w:p>
     <w:p>
-      <w:pPr>
-        <w:pStyle w:val="Heading2"/>
+      <w:r>
+        <w:br w:type="page"/>
+      </w:r>
+    </w:p>
+    <w:p>
+      <w:pPr>
+        <w:pStyle w:val="berschrift2"/>
         <w:rPr>
           <w:rFonts w:asciiTheme="minorHAnsi" w:hAnsiTheme="minorHAnsi" w:cstheme="minorHAnsi"/>
         </w:rPr>
@@ -720,6 +721,7 @@
         <w:rPr>
           <w:rFonts w:asciiTheme="minorHAnsi" w:hAnsiTheme="minorHAnsi" w:cstheme="minorHAnsi"/>
         </w:rPr>
+        <w:lastRenderedPageBreak/>
         <w:t>OrientationHandler</w:t>
       </w:r>
       <w:proofErr w:type="spellEnd"/>
@@ -739,7 +741,7 @@
     </w:p>
     <w:p>
       <w:pPr>
-        <w:pStyle w:val="Heading3"/>
+        <w:pStyle w:val="berschrift3"/>
         <w:spacing w:line="240" w:lineRule="auto"/>
         <w:rPr>
           <w:rFonts w:asciiTheme="minorHAnsi" w:hAnsiTheme="minorHAnsi" w:cstheme="minorHAnsi"/>
@@ -754,7 +756,7 @@
     </w:p>
     <w:tbl>
       <w:tblPr>
-        <w:tblStyle w:val="TableGrid"/>
+        <w:tblStyle w:val="Tabellenraster"/>
         <w:tblW w:w="0" w:type="auto"/>
         <w:tblLook w:val="04A0" w:firstRow="1" w:lastRow="0" w:firstColumn="1" w:lastColumn="0" w:noHBand="0" w:noVBand="1"/>
       </w:tblPr>
@@ -893,7 +895,7 @@
     </w:tbl>
     <w:p>
       <w:pPr>
-        <w:pStyle w:val="Heading3"/>
+        <w:pStyle w:val="berschrift3"/>
         <w:rPr>
           <w:rFonts w:asciiTheme="minorHAnsi" w:hAnsiTheme="minorHAnsi" w:cstheme="minorHAnsi"/>
         </w:rPr>
@@ -907,7 +909,7 @@
     </w:p>
     <w:tbl>
       <w:tblPr>
-        <w:tblStyle w:val="TableGrid"/>
+        <w:tblStyle w:val="Tabellenraster"/>
         <w:tblW w:w="0" w:type="auto"/>
         <w:tblLook w:val="04A0" w:firstRow="1" w:lastRow="0" w:firstColumn="1" w:lastColumn="0" w:noHBand="0" w:noVBand="1"/>
       </w:tblPr>
@@ -922,7 +924,7 @@
           </w:tcPr>
           <w:p>
             <w:pPr>
-              <w:pStyle w:val="Heading3"/>
+              <w:pStyle w:val="berschrift3"/>
               <w:rPr>
                 <w:rFonts w:asciiTheme="minorHAnsi" w:hAnsiTheme="minorHAnsi" w:cstheme="minorHAnsi"/>
                 <w:color w:val="000000" w:themeColor="text1"/>
@@ -947,7 +949,7 @@
           </w:tcPr>
           <w:p>
             <w:pPr>
-              <w:pStyle w:val="Heading3"/>
+              <w:pStyle w:val="berschrift3"/>
               <w:rPr>
                 <w:rFonts w:asciiTheme="minorHAnsi" w:hAnsiTheme="minorHAnsi" w:cstheme="minorHAnsi"/>
                 <w:color w:val="000000" w:themeColor="text1"/>
@@ -974,7 +976,7 @@
           </w:tcPr>
           <w:p>
             <w:pPr>
-              <w:pStyle w:val="Heading3"/>
+              <w:pStyle w:val="berschrift3"/>
               <w:rPr>
                 <w:rFonts w:asciiTheme="minorHAnsi" w:hAnsiTheme="minorHAnsi" w:cstheme="minorHAnsi"/>
                 <w:color w:val="000000" w:themeColor="text1"/>
@@ -1010,7 +1012,7 @@
           </w:tcPr>
           <w:p>
             <w:pPr>
-              <w:pStyle w:val="Heading3"/>
+              <w:pStyle w:val="berschrift3"/>
               <w:rPr>
                 <w:rFonts w:asciiTheme="minorHAnsi" w:hAnsiTheme="minorHAnsi" w:cstheme="minorHAnsi"/>
                 <w:color w:val="000000" w:themeColor="text1"/>
@@ -1037,7 +1039,7 @@
           </w:tcPr>
           <w:p>
             <w:pPr>
-              <w:pStyle w:val="Heading3"/>
+              <w:pStyle w:val="berschrift3"/>
               <w:rPr>
                 <w:rFonts w:asciiTheme="minorHAnsi" w:hAnsiTheme="minorHAnsi" w:cstheme="minorHAnsi"/>
                 <w:color w:val="000000" w:themeColor="text1"/>
@@ -1071,7 +1073,7 @@
           </w:tcPr>
           <w:p>
             <w:pPr>
-              <w:pStyle w:val="Heading3"/>
+              <w:pStyle w:val="berschrift3"/>
               <w:rPr>
                 <w:rFonts w:asciiTheme="minorHAnsi" w:hAnsiTheme="minorHAnsi" w:cstheme="minorHAnsi"/>
                 <w:color w:val="000000" w:themeColor="text1"/>
@@ -1094,7 +1096,7 @@
     </w:tbl>
     <w:p>
       <w:pPr>
-        <w:pStyle w:val="Heading3"/>
+        <w:pStyle w:val="berschrift3"/>
         <w:rPr>
           <w:rFonts w:asciiTheme="minorHAnsi" w:hAnsiTheme="minorHAnsi" w:cstheme="minorHAnsi"/>
         </w:rPr>
@@ -1108,7 +1110,7 @@
     </w:p>
     <w:tbl>
       <w:tblPr>
-        <w:tblStyle w:val="TableGrid"/>
+        <w:tblStyle w:val="Tabellenraster"/>
         <w:tblW w:w="0" w:type="auto"/>
         <w:tblLook w:val="04A0" w:firstRow="1" w:lastRow="0" w:firstColumn="1" w:lastColumn="0" w:noHBand="0" w:noVBand="1"/>
       </w:tblPr>
@@ -1123,7 +1125,7 @@
           </w:tcPr>
           <w:p>
             <w:pPr>
-              <w:pStyle w:val="Heading4"/>
+              <w:pStyle w:val="berschrift4"/>
               <w:rPr>
                 <w:rFonts w:asciiTheme="minorHAnsi" w:hAnsiTheme="minorHAnsi" w:cstheme="minorHAnsi"/>
                 <w:sz w:val="20"/>
@@ -1177,7 +1179,7 @@
           </w:tcPr>
           <w:p>
             <w:pPr>
-              <w:pStyle w:val="Heading3"/>
+              <w:pStyle w:val="berschrift3"/>
               <w:rPr>
                 <w:rFonts w:asciiTheme="minorHAnsi" w:hAnsiTheme="minorHAnsi" w:cstheme="minorHAnsi"/>
                 <w:color w:val="000000" w:themeColor="text1"/>
@@ -1192,16 +1194,7 @@
                 <w:sz w:val="22"/>
                 <w:szCs w:val="22"/>
               </w:rPr>
-              <w:t>Initialisiert die Orientierung auf 0 für alle drei Achsen</w:t>
-            </w:r>
-            <w:r>
-              <w:rPr>
-                <w:rFonts w:asciiTheme="minorHAnsi" w:hAnsiTheme="minorHAnsi" w:cstheme="minorHAnsi"/>
-                <w:color w:val="000000" w:themeColor="text1"/>
-                <w:sz w:val="22"/>
-                <w:szCs w:val="22"/>
-              </w:rPr>
-              <w:t>.</w:t>
+              <w:t>Initialisiert die Orientierung auf 0 für alle drei Achsen.</w:t>
             </w:r>
           </w:p>
         </w:tc>
@@ -1213,7 +1206,7 @@
           </w:tcPr>
           <w:p>
             <w:pPr>
-              <w:pStyle w:val="Heading4"/>
+              <w:pStyle w:val="berschrift4"/>
               <w:rPr>
                 <w:rFonts w:asciiTheme="minorHAnsi" w:hAnsiTheme="minorHAnsi" w:cstheme="minorHAnsi"/>
                 <w:sz w:val="20"/>
@@ -1298,7 +1291,7 @@
           </w:tcPr>
           <w:p>
             <w:pPr>
-              <w:pStyle w:val="Heading4"/>
+              <w:pStyle w:val="berschrift4"/>
               <w:rPr>
                 <w:rFonts w:asciiTheme="minorHAnsi" w:hAnsiTheme="minorHAnsi" w:cstheme="minorHAnsi"/>
                 <w:sz w:val="20"/>
@@ -1383,7 +1376,7 @@
           </w:tcPr>
           <w:p>
             <w:pPr>
-              <w:pStyle w:val="Heading4"/>
+              <w:pStyle w:val="berschrift4"/>
               <w:rPr>
                 <w:rFonts w:asciiTheme="minorHAnsi" w:hAnsiTheme="minorHAnsi" w:cstheme="minorHAnsi"/>
                 <w:sz w:val="20"/>
@@ -1473,7 +1466,7 @@
     </w:tbl>
     <w:p>
       <w:pPr>
-        <w:pStyle w:val="Heading2"/>
+        <w:pStyle w:val="berschrift2"/>
         <w:rPr>
           <w:rFonts w:asciiTheme="minorHAnsi" w:hAnsiTheme="minorHAnsi" w:cstheme="minorHAnsi"/>
         </w:rPr>
@@ -1497,7 +1490,7 @@
     </w:p>
     <w:p>
       <w:pPr>
-        <w:pStyle w:val="Heading2"/>
+        <w:pStyle w:val="berschrift2"/>
         <w:rPr>
           <w:rFonts w:asciiTheme="minorHAnsi" w:hAnsiTheme="minorHAnsi" w:cstheme="minorHAnsi"/>
         </w:rPr>
@@ -1522,7 +1515,7 @@
     </w:p>
     <w:p>
       <w:pPr>
-        <w:pStyle w:val="ListParagraph"/>
+        <w:pStyle w:val="Listenabsatz"/>
         <w:numPr>
           <w:ilvl w:val="0"/>
           <w:numId w:val="6"/>
@@ -1540,7 +1533,7 @@
     </w:p>
     <w:p>
       <w:pPr>
-        <w:pStyle w:val="ListParagraph"/>
+        <w:pStyle w:val="Listenabsatz"/>
         <w:numPr>
           <w:ilvl w:val="0"/>
           <w:numId w:val="6"/>
@@ -1564,7 +1557,7 @@
     </w:p>
     <w:p>
       <w:pPr>
-        <w:pStyle w:val="Heading3"/>
+        <w:pStyle w:val="berschrift3"/>
         <w:rPr>
           <w:rFonts w:asciiTheme="minorHAnsi" w:hAnsiTheme="minorHAnsi" w:cstheme="minorHAnsi"/>
         </w:rPr>
@@ -1578,7 +1571,7 @@
     </w:p>
     <w:tbl>
       <w:tblPr>
-        <w:tblStyle w:val="TableGrid"/>
+        <w:tblStyle w:val="Tabellenraster"/>
         <w:tblW w:w="0" w:type="auto"/>
         <w:tblLook w:val="04A0" w:firstRow="1" w:lastRow="0" w:firstColumn="1" w:lastColumn="0" w:noHBand="0" w:noVBand="1"/>
       </w:tblPr>
@@ -1596,7 +1589,7 @@
           </w:tcPr>
           <w:p>
             <w:pPr>
-              <w:pStyle w:val="Heading3"/>
+              <w:pStyle w:val="berschrift3"/>
               <w:rPr>
                 <w:rFonts w:asciiTheme="minorHAnsi" w:hAnsiTheme="minorHAnsi" w:cstheme="minorHAnsi"/>
                 <w:color w:val="000000" w:themeColor="text1"/>
@@ -1623,7 +1616,7 @@
           </w:tcPr>
           <w:p>
             <w:pPr>
-              <w:pStyle w:val="Heading3"/>
+              <w:pStyle w:val="berschrift3"/>
               <w:rPr>
                 <w:rFonts w:asciiTheme="minorHAnsi" w:hAnsiTheme="minorHAnsi" w:cstheme="minorHAnsi"/>
                 <w:color w:val="000000" w:themeColor="text1"/>
@@ -1650,7 +1643,7 @@
           </w:tcPr>
           <w:p>
             <w:pPr>
-              <w:pStyle w:val="Heading3"/>
+              <w:pStyle w:val="berschrift3"/>
               <w:rPr>
                 <w:rFonts w:asciiTheme="minorHAnsi" w:hAnsiTheme="minorHAnsi" w:cstheme="minorHAnsi"/>
                 <w:color w:val="000000" w:themeColor="text1"/>
@@ -1677,7 +1670,7 @@
           </w:tcPr>
           <w:p>
             <w:pPr>
-              <w:pStyle w:val="Heading3"/>
+              <w:pStyle w:val="berschrift3"/>
               <w:rPr>
                 <w:rFonts w:asciiTheme="minorHAnsi" w:hAnsiTheme="minorHAnsi" w:cstheme="minorHAnsi"/>
                 <w:color w:val="000000" w:themeColor="text1"/>
@@ -1700,7 +1693,7 @@
     </w:tbl>
     <w:p>
       <w:pPr>
-        <w:pStyle w:val="Heading3"/>
+        <w:pStyle w:val="berschrift3"/>
         <w:rPr>
           <w:rFonts w:asciiTheme="minorHAnsi" w:hAnsiTheme="minorHAnsi" w:cstheme="minorHAnsi"/>
         </w:rPr>
@@ -1714,7 +1707,7 @@
     </w:p>
     <w:tbl>
       <w:tblPr>
-        <w:tblStyle w:val="TableGrid"/>
+        <w:tblStyle w:val="Tabellenraster"/>
         <w:tblW w:w="0" w:type="auto"/>
         <w:tblLook w:val="04A0" w:firstRow="1" w:lastRow="0" w:firstColumn="1" w:lastColumn="0" w:noHBand="0" w:noVBand="1"/>
       </w:tblPr>
@@ -1729,7 +1722,7 @@
           </w:tcPr>
           <w:p>
             <w:pPr>
-              <w:pStyle w:val="Heading4"/>
+              <w:pStyle w:val="berschrift4"/>
               <w:rPr>
                 <w:rFonts w:asciiTheme="minorHAnsi" w:hAnsiTheme="minorHAnsi" w:cstheme="minorHAnsi"/>
                 <w:sz w:val="20"/>
@@ -1806,7 +1799,7 @@
           </w:tcPr>
           <w:p>
             <w:pPr>
-              <w:pStyle w:val="Heading4"/>
+              <w:pStyle w:val="berschrift4"/>
               <w:rPr>
                 <w:rFonts w:asciiTheme="minorHAnsi" w:hAnsiTheme="minorHAnsi" w:cstheme="minorHAnsi"/>
                 <w:sz w:val="20"/>
@@ -1894,7 +1887,7 @@
           </w:tcPr>
           <w:p>
             <w:pPr>
-              <w:pStyle w:val="Heading4"/>
+              <w:pStyle w:val="berschrift4"/>
               <w:rPr>
                 <w:rFonts w:asciiTheme="minorHAnsi" w:hAnsiTheme="minorHAnsi" w:cstheme="minorHAnsi"/>
                 <w:sz w:val="20"/>
@@ -1979,7 +1972,7 @@
           </w:tcPr>
           <w:p>
             <w:pPr>
-              <w:pStyle w:val="Heading4"/>
+              <w:pStyle w:val="berschrift4"/>
               <w:rPr>
                 <w:rFonts w:asciiTheme="minorHAnsi" w:hAnsiTheme="minorHAnsi" w:cstheme="minorHAnsi"/>
                 <w:sz w:val="20"/>
@@ -2068,7 +2061,7 @@
             </w:pPr>
             <w:r>
               <w:rPr>
-                <w:rStyle w:val="Strong"/>
+                <w:rStyle w:val="Fett"/>
                 <w:rFonts w:cstheme="minorHAnsi"/>
               </w:rPr>
               <w:t>Große Objekte</w:t>
@@ -2093,7 +2086,7 @@
             </w:pPr>
             <w:r>
               <w:rPr>
-                <w:rStyle w:val="Strong"/>
+                <w:rStyle w:val="Fett"/>
                 <w:rFonts w:cstheme="minorHAnsi"/>
               </w:rPr>
               <w:t>Kleine Objekte</w:t>
@@ -2114,7 +2107,7 @@
           </w:tcPr>
           <w:p>
             <w:pPr>
-              <w:pStyle w:val="Heading4"/>
+              <w:pStyle w:val="berschrift4"/>
               <w:rPr>
                 <w:rStyle w:val="HTMLCode"/>
                 <w:rFonts w:asciiTheme="minorHAnsi" w:eastAsiaTheme="majorEastAsia" w:hAnsiTheme="minorHAnsi" w:cstheme="minorHAnsi"/>
@@ -2214,7 +2207,7 @@
     <w:p/>
     <w:p>
       <w:pPr>
-        <w:pStyle w:val="Heading2"/>
+        <w:pStyle w:val="berschrift2"/>
         <w:rPr>
           <w:rFonts w:asciiTheme="minorHAnsi" w:hAnsiTheme="minorHAnsi" w:cstheme="minorHAnsi"/>
         </w:rPr>
@@ -2235,7 +2228,7 @@
     </w:p>
     <w:p>
       <w:pPr>
-        <w:pStyle w:val="Heading3"/>
+        <w:pStyle w:val="berschrift3"/>
         <w:spacing w:line="240" w:lineRule="auto"/>
         <w:rPr>
           <w:rFonts w:asciiTheme="minorHAnsi" w:hAnsiTheme="minorHAnsi" w:cstheme="minorHAnsi"/>
@@ -2250,7 +2243,7 @@
     </w:p>
     <w:tbl>
       <w:tblPr>
-        <w:tblStyle w:val="TableGrid"/>
+        <w:tblStyle w:val="Tabellenraster"/>
         <w:tblW w:w="0" w:type="auto"/>
         <w:tblLook w:val="04A0" w:firstRow="1" w:lastRow="0" w:firstColumn="1" w:lastColumn="0" w:noHBand="0" w:noVBand="1"/>
       </w:tblPr>
@@ -2827,7 +2820,7 @@
     </w:tbl>
     <w:p>
       <w:pPr>
-        <w:pStyle w:val="Heading3"/>
+        <w:pStyle w:val="berschrift3"/>
         <w:rPr>
           <w:rFonts w:asciiTheme="minorHAnsi" w:hAnsiTheme="minorHAnsi" w:cstheme="minorHAnsi"/>
         </w:rPr>
@@ -2841,7 +2834,7 @@
     </w:p>
     <w:tbl>
       <w:tblPr>
-        <w:tblStyle w:val="TableGrid"/>
+        <w:tblStyle w:val="Tabellenraster"/>
         <w:tblW w:w="0" w:type="auto"/>
         <w:tblLook w:val="04A0" w:firstRow="1" w:lastRow="0" w:firstColumn="1" w:lastColumn="0" w:noHBand="0" w:noVBand="1"/>
       </w:tblPr>
@@ -3083,7 +3076,7 @@
     <w:p/>
     <w:p>
       <w:pPr>
-        <w:pStyle w:val="Heading3"/>
+        <w:pStyle w:val="berschrift3"/>
         <w:rPr>
           <w:rFonts w:asciiTheme="minorHAnsi" w:hAnsiTheme="minorHAnsi" w:cstheme="minorHAnsi"/>
         </w:rPr>
@@ -3098,7 +3091,7 @@
     </w:p>
     <w:tbl>
       <w:tblPr>
-        <w:tblStyle w:val="TableGrid"/>
+        <w:tblStyle w:val="Tabellenraster"/>
         <w:tblW w:w="0" w:type="auto"/>
         <w:tblLook w:val="04A0" w:firstRow="1" w:lastRow="0" w:firstColumn="1" w:lastColumn="0" w:noHBand="0" w:noVBand="1"/>
       </w:tblPr>
@@ -3113,7 +3106,7 @@
           </w:tcPr>
           <w:p>
             <w:pPr>
-              <w:pStyle w:val="Heading4"/>
+              <w:pStyle w:val="berschrift4"/>
               <w:rPr>
                 <w:rStyle w:val="HTMLCode"/>
                 <w:rFonts w:asciiTheme="minorHAnsi" w:eastAsiaTheme="majorEastAsia" w:hAnsiTheme="minorHAnsi" w:cstheme="minorHAnsi"/>
@@ -3191,7 +3184,7 @@
           </w:tcPr>
           <w:p>
             <w:pPr>
-              <w:pStyle w:val="Heading4"/>
+              <w:pStyle w:val="berschrift4"/>
               <w:rPr>
                 <w:rStyle w:val="HTMLCode"/>
                 <w:rFonts w:asciiTheme="minorHAnsi" w:eastAsiaTheme="majorEastAsia" w:hAnsiTheme="minorHAnsi" w:cstheme="minorHAnsi"/>
@@ -3261,7 +3254,7 @@
           </w:tcPr>
           <w:p>
             <w:pPr>
-              <w:pStyle w:val="Heading4"/>
+              <w:pStyle w:val="berschrift4"/>
               <w:rPr>
                 <w:rStyle w:val="HTMLCode"/>
                 <w:rFonts w:asciiTheme="minorHAnsi" w:eastAsiaTheme="majorEastAsia" w:hAnsiTheme="minorHAnsi" w:cstheme="minorHAnsi"/>
@@ -3308,7 +3301,7 @@
           </w:tcPr>
           <w:p>
             <w:pPr>
-              <w:pStyle w:val="Heading4"/>
+              <w:pStyle w:val="berschrift4"/>
               <w:rPr>
                 <w:rStyle w:val="HTMLCode"/>
                 <w:rFonts w:asciiTheme="minorHAnsi" w:eastAsiaTheme="majorEastAsia" w:hAnsiTheme="minorHAnsi" w:cstheme="minorHAnsi"/>
@@ -3338,7 +3331,7 @@
           </w:tcPr>
           <w:p>
             <w:pPr>
-              <w:pStyle w:val="Heading4"/>
+              <w:pStyle w:val="berschrift4"/>
               <w:rPr>
                 <w:rStyle w:val="HTMLCode"/>
                 <w:rFonts w:asciiTheme="minorHAnsi" w:eastAsiaTheme="majorEastAsia" w:hAnsiTheme="minorHAnsi" w:cstheme="minorHAnsi"/>
@@ -3409,7 +3402,7 @@
           </w:tcPr>
           <w:p>
             <w:pPr>
-              <w:pStyle w:val="Heading4"/>
+              <w:pStyle w:val="berschrift4"/>
               <w:rPr>
                 <w:rStyle w:val="HTMLCode"/>
                 <w:rFonts w:asciiTheme="minorHAnsi" w:eastAsiaTheme="majorEastAsia" w:hAnsiTheme="minorHAnsi" w:cstheme="minorHAnsi"/>
@@ -3439,7 +3432,7 @@
           </w:tcPr>
           <w:p>
             <w:pPr>
-              <w:pStyle w:val="Heading4"/>
+              <w:pStyle w:val="berschrift4"/>
               <w:rPr>
                 <w:rStyle w:val="HTMLCode"/>
                 <w:rFonts w:asciiTheme="minorHAnsi" w:eastAsiaTheme="majorEastAsia" w:hAnsiTheme="minorHAnsi" w:cstheme="minorHAnsi"/>
@@ -3490,7 +3483,7 @@
           </w:tcPr>
           <w:p>
             <w:pPr>
-              <w:pStyle w:val="Heading4"/>
+              <w:pStyle w:val="berschrift4"/>
               <w:rPr>
                 <w:rStyle w:val="HTMLCode"/>
                 <w:rFonts w:asciiTheme="minorHAnsi" w:eastAsiaTheme="majorEastAsia" w:hAnsiTheme="minorHAnsi" w:cstheme="minorHAnsi"/>
@@ -3616,7 +3609,7 @@
           </w:tcPr>
           <w:p>
             <w:pPr>
-              <w:pStyle w:val="Heading4"/>
+              <w:pStyle w:val="berschrift4"/>
               <w:rPr>
                 <w:rStyle w:val="HTMLCode"/>
                 <w:rFonts w:asciiTheme="minorHAnsi" w:eastAsiaTheme="majorEastAsia" w:hAnsiTheme="minorHAnsi" w:cstheme="minorHAnsi"/>
@@ -3667,7 +3660,7 @@
           </w:tcPr>
           <w:p>
             <w:pPr>
-              <w:pStyle w:val="Heading4"/>
+              <w:pStyle w:val="berschrift4"/>
               <w:rPr>
                 <w:rStyle w:val="HTMLCode"/>
                 <w:rFonts w:asciiTheme="minorHAnsi" w:eastAsiaTheme="majorEastAsia" w:hAnsiTheme="minorHAnsi" w:cstheme="minorHAnsi"/>
@@ -3697,7 +3690,7 @@
           </w:tcPr>
           <w:p>
             <w:pPr>
-              <w:pStyle w:val="Heading4"/>
+              <w:pStyle w:val="berschrift4"/>
               <w:rPr>
                 <w:rStyle w:val="HTMLCode"/>
                 <w:rFonts w:asciiTheme="minorHAnsi" w:eastAsiaTheme="majorEastAsia" w:hAnsiTheme="minorHAnsi" w:cstheme="minorHAnsi"/>
@@ -3710,14 +3703,7 @@
                 <w:rStyle w:val="HTMLCode"/>
                 <w:rFonts w:asciiTheme="minorHAnsi" w:eastAsiaTheme="majorEastAsia" w:hAnsiTheme="minorHAnsi" w:cstheme="minorHAnsi"/>
               </w:rPr>
-              <w:t>o</w:t>
-            </w:r>
-            <w:r>
-              <w:rPr>
-                <w:rStyle w:val="HTMLCode"/>
-                <w:rFonts w:asciiTheme="minorHAnsi" w:eastAsiaTheme="majorEastAsia" w:hAnsiTheme="minorHAnsi" w:cstheme="minorHAnsi"/>
-              </w:rPr>
-              <w:t>n_measure_button</w:t>
+              <w:t>on_measure_button</w:t>
             </w:r>
             <w:proofErr w:type="spellEnd"/>
             <w:r>
@@ -3751,7 +3737,7 @@
           </w:tcPr>
           <w:p>
             <w:pPr>
-              <w:pStyle w:val="Heading4"/>
+              <w:pStyle w:val="berschrift4"/>
               <w:rPr>
                 <w:rStyle w:val="HTMLCode"/>
                 <w:rFonts w:asciiTheme="minorHAnsi" w:eastAsiaTheme="majorEastAsia" w:hAnsiTheme="minorHAnsi" w:cstheme="minorHAnsi"/>
@@ -3781,7 +3767,7 @@
           </w:tcPr>
           <w:p>
             <w:pPr>
-              <w:pStyle w:val="Heading4"/>
+              <w:pStyle w:val="berschrift4"/>
               <w:rPr>
                 <w:rStyle w:val="HTMLCode"/>
                 <w:rFonts w:asciiTheme="minorHAnsi" w:eastAsiaTheme="majorEastAsia" w:hAnsiTheme="minorHAnsi" w:cstheme="minorHAnsi"/>
@@ -3828,7 +3814,7 @@
           </w:tcPr>
           <w:p>
             <w:pPr>
-              <w:pStyle w:val="Heading4"/>
+              <w:pStyle w:val="berschrift4"/>
               <w:rPr>
                 <w:rStyle w:val="HTMLCode"/>
                 <w:rFonts w:asciiTheme="minorHAnsi" w:eastAsiaTheme="majorEastAsia" w:hAnsiTheme="minorHAnsi" w:cstheme="minorHAnsi"/>
@@ -3878,7 +3864,7 @@
           </w:tcPr>
           <w:p>
             <w:pPr>
-              <w:pStyle w:val="Heading4"/>
+              <w:pStyle w:val="berschrift4"/>
               <w:rPr>
                 <w:rStyle w:val="HTMLCode"/>
                 <w:rFonts w:asciiTheme="minorHAnsi" w:eastAsiaTheme="majorEastAsia" w:hAnsiTheme="minorHAnsi" w:cstheme="minorHAnsi"/>
@@ -3925,7 +3911,7 @@
           </w:tcPr>
           <w:p>
             <w:pPr>
-              <w:pStyle w:val="Heading4"/>
+              <w:pStyle w:val="berschrift4"/>
               <w:rPr>
                 <w:rStyle w:val="HTMLCode"/>
                 <w:rFonts w:asciiTheme="minorHAnsi" w:eastAsiaTheme="majorEastAsia" w:hAnsiTheme="minorHAnsi" w:cstheme="minorHAnsi"/>
@@ -3955,7 +3941,7 @@
           </w:tcPr>
           <w:p>
             <w:pPr>
-              <w:pStyle w:val="Heading4"/>
+              <w:pStyle w:val="berschrift4"/>
               <w:rPr>
                 <w:rStyle w:val="HTMLCode"/>
                 <w:rFonts w:asciiTheme="minorHAnsi" w:eastAsiaTheme="majorEastAsia" w:hAnsiTheme="minorHAnsi" w:cstheme="minorHAnsi"/>
@@ -4006,7 +3992,7 @@
           </w:tcPr>
           <w:p>
             <w:pPr>
-              <w:pStyle w:val="Heading4"/>
+              <w:pStyle w:val="berschrift4"/>
               <w:rPr>
                 <w:rStyle w:val="HTMLCode"/>
                 <w:rFonts w:asciiTheme="minorHAnsi" w:eastAsiaTheme="majorEastAsia" w:hAnsiTheme="minorHAnsi" w:cstheme="minorHAnsi"/>
@@ -4032,7 +4018,7 @@
     </w:tbl>
     <w:p>
       <w:pPr>
-        <w:pStyle w:val="Heading2"/>
+        <w:pStyle w:val="berschrift2"/>
         <w:rPr>
           <w:rFonts w:asciiTheme="minorHAnsi" w:hAnsiTheme="minorHAnsi" w:cstheme="minorHAnsi"/>
         </w:rPr>
@@ -4040,7 +4026,7 @@
     </w:p>
     <w:p>
       <w:pPr>
-        <w:pStyle w:val="Heading2"/>
+        <w:pStyle w:val="berschrift2"/>
         <w:rPr>
           <w:rFonts w:asciiTheme="minorHAnsi" w:hAnsiTheme="minorHAnsi" w:cstheme="minorHAnsi"/>
         </w:rPr>
@@ -4117,7 +4103,7 @@
     </w:p>
     <w:p>
       <w:pPr>
-        <w:pStyle w:val="Heading3"/>
+        <w:pStyle w:val="berschrift3"/>
         <w:spacing w:line="240" w:lineRule="auto"/>
         <w:rPr>
           <w:rFonts w:asciiTheme="minorHAnsi" w:hAnsiTheme="minorHAnsi" w:cstheme="minorHAnsi"/>
@@ -4132,7 +4118,7 @@
     </w:p>
     <w:tbl>
       <w:tblPr>
-        <w:tblStyle w:val="TableGrid"/>
+        <w:tblStyle w:val="Tabellenraster"/>
         <w:tblW w:w="0" w:type="auto"/>
         <w:tblLook w:val="04A0" w:firstRow="1" w:lastRow="0" w:firstColumn="1" w:lastColumn="0" w:noHBand="0" w:noVBand="1"/>
       </w:tblPr>
@@ -4227,13 +4213,7 @@
               <w:rPr>
                 <w:rFonts w:cstheme="minorHAnsi"/>
               </w:rPr>
-              <w:t>r</w:t>
-            </w:r>
-            <w:r>
-              <w:rPr>
-                <w:rFonts w:cstheme="minorHAnsi"/>
-              </w:rPr>
-              <w:t>equest_permissions</w:t>
+              <w:t>request_permissions</w:t>
             </w:r>
             <w:proofErr w:type="spellEnd"/>
           </w:p>
@@ -4330,7 +4310,7 @@
     </w:tbl>
     <w:p>
       <w:pPr>
-        <w:pStyle w:val="Heading3"/>
+        <w:pStyle w:val="berschrift3"/>
         <w:rPr>
           <w:rFonts w:asciiTheme="minorHAnsi" w:hAnsiTheme="minorHAnsi" w:cstheme="minorHAnsi"/>
         </w:rPr>
@@ -4344,7 +4324,7 @@
     </w:p>
     <w:tbl>
       <w:tblPr>
-        <w:tblStyle w:val="TableGrid"/>
+        <w:tblStyle w:val="Tabellenraster"/>
         <w:tblW w:w="0" w:type="auto"/>
         <w:tblLook w:val="04A0" w:firstRow="1" w:lastRow="0" w:firstColumn="1" w:lastColumn="0" w:noHBand="0" w:noVBand="1"/>
       </w:tblPr>
@@ -4359,7 +4339,7 @@
           </w:tcPr>
           <w:p>
             <w:pPr>
-              <w:pStyle w:val="Heading3"/>
+              <w:pStyle w:val="berschrift3"/>
               <w:rPr>
                 <w:rFonts w:asciiTheme="minorHAnsi" w:hAnsiTheme="minorHAnsi" w:cstheme="minorHAnsi"/>
                 <w:color w:val="000000" w:themeColor="text1"/>
@@ -4386,7 +4366,7 @@
           </w:tcPr>
           <w:p>
             <w:pPr>
-              <w:pStyle w:val="Heading3"/>
+              <w:pStyle w:val="berschrift3"/>
               <w:rPr>
                 <w:rFonts w:asciiTheme="minorHAnsi" w:hAnsiTheme="minorHAnsi" w:cstheme="minorHAnsi"/>
                 <w:color w:val="000000" w:themeColor="text1"/>
@@ -4413,7 +4393,7 @@
           </w:tcPr>
           <w:p>
             <w:pPr>
-              <w:pStyle w:val="Heading3"/>
+              <w:pStyle w:val="berschrift3"/>
               <w:rPr>
                 <w:rFonts w:asciiTheme="minorHAnsi" w:hAnsiTheme="minorHAnsi" w:cstheme="minorHAnsi"/>
                 <w:color w:val="000000" w:themeColor="text1"/>
@@ -4449,7 +4429,7 @@
           </w:tcPr>
           <w:p>
             <w:pPr>
-              <w:pStyle w:val="Heading3"/>
+              <w:pStyle w:val="berschrift3"/>
               <w:rPr>
                 <w:rFonts w:asciiTheme="minorHAnsi" w:hAnsiTheme="minorHAnsi" w:cstheme="minorHAnsi"/>
                 <w:color w:val="000000" w:themeColor="text1"/>
@@ -4523,7 +4503,7 @@
     </w:tbl>
     <w:p>
       <w:pPr>
-        <w:pStyle w:val="Heading3"/>
+        <w:pStyle w:val="berschrift3"/>
         <w:rPr>
           <w:rFonts w:asciiTheme="minorHAnsi" w:hAnsiTheme="minorHAnsi" w:cstheme="minorHAnsi"/>
           <w:lang w:val="en-GB"/>
@@ -4541,13 +4521,13 @@
     </w:p>
     <w:tbl>
       <w:tblPr>
-        <w:tblStyle w:val="TableGrid"/>
+        <w:tblStyle w:val="Tabellenraster"/>
         <w:tblW w:w="0" w:type="auto"/>
         <w:tblLook w:val="04A0" w:firstRow="1" w:lastRow="0" w:firstColumn="1" w:lastColumn="0" w:noHBand="0" w:noVBand="1"/>
       </w:tblPr>
       <w:tblGrid>
-        <w:gridCol w:w="2692"/>
-        <w:gridCol w:w="6370"/>
+        <w:gridCol w:w="2895"/>
+        <w:gridCol w:w="6167"/>
       </w:tblGrid>
       <w:tr>
         <w:tc>
@@ -4556,7 +4536,7 @@
           </w:tcPr>
           <w:p>
             <w:pPr>
-              <w:pStyle w:val="Heading4"/>
+              <w:pStyle w:val="berschrift4"/>
               <w:rPr>
                 <w:rFonts w:asciiTheme="minorHAnsi" w:hAnsiTheme="minorHAnsi" w:cstheme="minorHAnsi"/>
                 <w:sz w:val="20"/>
@@ -4624,7 +4604,7 @@
           </w:tcPr>
           <w:p>
             <w:pPr>
-              <w:pStyle w:val="Heading4"/>
+              <w:pStyle w:val="berschrift4"/>
               <w:rPr>
                 <w:rFonts w:asciiTheme="minorHAnsi" w:hAnsiTheme="minorHAnsi" w:cstheme="minorHAnsi"/>
                 <w:sz w:val="20"/>
@@ -4675,7 +4655,7 @@
           </w:tcPr>
           <w:p>
             <w:pPr>
-              <w:pStyle w:val="Heading4"/>
+              <w:pStyle w:val="berschrift4"/>
               <w:rPr>
                 <w:rFonts w:asciiTheme="minorHAnsi" w:hAnsiTheme="minorHAnsi" w:cstheme="minorHAnsi"/>
                 <w:sz w:val="20"/>
@@ -4740,7 +4720,7 @@
           </w:tcPr>
           <w:p>
             <w:pPr>
-              <w:pStyle w:val="Heading4"/>
+              <w:pStyle w:val="berschrift4"/>
               <w:rPr>
                 <w:rFonts w:asciiTheme="minorHAnsi" w:hAnsiTheme="minorHAnsi" w:cstheme="minorHAnsi"/>
                 <w:sz w:val="20"/>
@@ -4797,7 +4777,7 @@
           </w:tcPr>
           <w:p>
             <w:pPr>
-              <w:pStyle w:val="Heading4"/>
+              <w:pStyle w:val="berschrift4"/>
               <w:rPr>
                 <w:rFonts w:asciiTheme="minorHAnsi" w:hAnsiTheme="minorHAnsi" w:cstheme="minorHAnsi"/>
                 <w:sz w:val="20"/>
@@ -4847,11 +4827,105 @@
           </w:p>
         </w:tc>
       </w:tr>
+      <w:tr>
+        <w:tc>
+          <w:tcPr>
+            <w:tcW w:w="2547" w:type="dxa"/>
+          </w:tcPr>
+          <w:p>
+            <w:pPr>
+              <w:pStyle w:val="berschrift4"/>
+              <w:rPr>
+                <w:rFonts w:cstheme="minorHAnsi"/>
+                <w:sz w:val="20"/>
+                <w:szCs w:val="20"/>
+                <w:lang w:val="en-US"/>
+              </w:rPr>
+            </w:pPr>
+            <w:proofErr w:type="spellStart"/>
+            <w:r>
+              <w:rPr>
+                <w:rFonts w:cstheme="minorHAnsi"/>
+                <w:sz w:val="20"/>
+                <w:szCs w:val="20"/>
+                <w:lang w:val="en-US"/>
+              </w:rPr>
+              <w:t>export_height_data_as_</w:t>
+            </w:r>
+            <w:proofErr w:type="gramStart"/>
+            <w:r>
+              <w:rPr>
+                <w:rFonts w:cstheme="minorHAnsi"/>
+                <w:sz w:val="20"/>
+                <w:szCs w:val="20"/>
+                <w:lang w:val="en-US"/>
+              </w:rPr>
+              <w:t>json</w:t>
+            </w:r>
+            <w:proofErr w:type="spellEnd"/>
+            <w:r>
+              <w:rPr>
+                <w:rFonts w:cstheme="minorHAnsi"/>
+                <w:sz w:val="20"/>
+                <w:szCs w:val="20"/>
+                <w:lang w:val="en-US"/>
+              </w:rPr>
+              <w:t>(</w:t>
+            </w:r>
+            <w:proofErr w:type="gramEnd"/>
+            <w:r>
+              <w:rPr>
+                <w:rFonts w:cstheme="minorHAnsi"/>
+                <w:sz w:val="20"/>
+                <w:szCs w:val="20"/>
+                <w:lang w:val="en-US"/>
+              </w:rPr>
+              <w:t>self, height)</w:t>
+            </w:r>
+          </w:p>
+          <w:p>
+            <w:pPr>
+              <w:pStyle w:val="berschrift4"/>
+              <w:rPr>
+                <w:rStyle w:val="HTMLCode"/>
+                <w:rFonts w:asciiTheme="minorHAnsi" w:eastAsiaTheme="majorEastAsia" w:hAnsiTheme="minorHAnsi" w:cstheme="minorHAnsi"/>
+                <w:lang w:val="en-GB"/>
+              </w:rPr>
+            </w:pPr>
+          </w:p>
+        </w:tc>
+        <w:tc>
+          <w:tcPr>
+            <w:tcW w:w="6515" w:type="dxa"/>
+          </w:tcPr>
+          <w:p>
+            <w:r>
+              <w:t xml:space="preserve">Speichert beim berechnen der Höhe den gemessenen Wert in einer </w:t>
+            </w:r>
+            <w:proofErr w:type="spellStart"/>
+            <w:r>
+              <w:t>json</w:t>
+            </w:r>
+            <w:proofErr w:type="spellEnd"/>
+            <w:r>
+              <w:t>-file unter „./</w:t>
+            </w:r>
+            <w:proofErr w:type="spellStart"/>
+            <w:r>
+              <w:t>heigt-data.json</w:t>
+            </w:r>
+            <w:proofErr w:type="spellEnd"/>
+            <w:r>
+              <w:t>“ ab</w:t>
+            </w:r>
+          </w:p>
+        </w:tc>
+      </w:tr>
     </w:tbl>
     <w:p/>
     <w:p>
       <w:pPr>
-        <w:pStyle w:val="Heading2"/>
+        <w:pStyle w:val="berschrift2"/>
         <w:rPr>
           <w:rFonts w:asciiTheme="minorHAnsi" w:hAnsiTheme="minorHAnsi" w:cstheme="minorHAnsi"/>
         </w:rPr>
@@ -4926,6 +5000,51 @@
       <w:proofErr w:type="spellEnd"/>
       <w:r>
         <w:t>.</w:t>
+      </w:r>
+    </w:p>
+    <w:p>
+      <w:r>
+        <w:t xml:space="preserve">Für die </w:t>
+      </w:r>
+      <w:proofErr w:type="spellStart"/>
+      <w:r>
+        <w:t>erstellung</w:t>
+      </w:r>
+      <w:proofErr w:type="spellEnd"/>
+      <w:r>
+        <w:t xml:space="preserve"> </w:t>
+      </w:r>
+      <w:proofErr w:type="spellStart"/>
+      <w:proofErr w:type="gramStart"/>
+      <w:r>
+        <w:t>der.kv</w:t>
+      </w:r>
+      <w:proofErr w:type="spellEnd"/>
+      <w:proofErr w:type="gramEnd"/>
+      <w:r>
+        <w:t xml:space="preserve"> </w:t>
+      </w:r>
+      <w:proofErr w:type="spellStart"/>
+      <w:r>
+        <w:t>file</w:t>
+      </w:r>
+      <w:proofErr w:type="spellEnd"/>
+      <w:r>
+        <w:t xml:space="preserve"> wurde die Doku von </w:t>
+      </w:r>
+      <w:proofErr w:type="spellStart"/>
+      <w:r>
+        <w:t>kivymd</w:t>
+      </w:r>
+      <w:proofErr w:type="spellEnd"/>
+      <w:r>
+        <w:t xml:space="preserve"> herangezogen:</w:t>
+      </w:r>
+      <w:r>
+        <w:br/>
+      </w:r>
+      <w:r>
+        <w:t>https://kivymd.readthedocs.io/en/latest/</w:t>
       </w:r>
     </w:p>
     <w:sectPr>
@@ -6264,15 +6383,15 @@
     <w:lsdException w:name="Unresolved Mention" w:semiHidden="1" w:unhideWhenUsed="1"/>
     <w:lsdException w:name="Smart Link" w:semiHidden="1" w:unhideWhenUsed="1"/>
   </w:latentStyles>
-  <w:style w:type="paragraph" w:default="1" w:styleId="Normal">
+  <w:style w:type="paragraph" w:default="1" w:styleId="Standard">
     <w:name w:val="Normal"/>
     <w:qFormat/>
   </w:style>
-  <w:style w:type="paragraph" w:styleId="Heading2">
+  <w:style w:type="paragraph" w:styleId="berschrift2">
     <w:name w:val="heading 2"/>
-    <w:basedOn w:val="Normal"/>
-    <w:next w:val="Normal"/>
-    <w:link w:val="Heading2Char"/>
+    <w:basedOn w:val="Standard"/>
+    <w:next w:val="Standard"/>
+    <w:link w:val="berschrift2Zchn"/>
     <w:uiPriority w:val="9"/>
     <w:unhideWhenUsed/>
     <w:qFormat/>
@@ -6290,11 +6409,11 @@
       <w:szCs w:val="26"/>
     </w:rPr>
   </w:style>
-  <w:style w:type="paragraph" w:styleId="Heading3">
+  <w:style w:type="paragraph" w:styleId="berschrift3">
     <w:name w:val="heading 3"/>
-    <w:basedOn w:val="Normal"/>
-    <w:next w:val="Normal"/>
-    <w:link w:val="Heading3Char"/>
+    <w:basedOn w:val="Standard"/>
+    <w:next w:val="Standard"/>
+    <w:link w:val="berschrift3Zchn"/>
     <w:uiPriority w:val="9"/>
     <w:unhideWhenUsed/>
     <w:qFormat/>
@@ -6312,11 +6431,11 @@
       <w:szCs w:val="24"/>
     </w:rPr>
   </w:style>
-  <w:style w:type="paragraph" w:styleId="Heading4">
+  <w:style w:type="paragraph" w:styleId="berschrift4">
     <w:name w:val="heading 4"/>
-    <w:basedOn w:val="Normal"/>
-    <w:next w:val="Normal"/>
-    <w:link w:val="Heading4Char"/>
+    <w:basedOn w:val="Standard"/>
+    <w:next w:val="Standard"/>
+    <w:link w:val="berschrift4Zchn"/>
     <w:uiPriority w:val="9"/>
     <w:unhideWhenUsed/>
     <w:qFormat/>
@@ -6334,12 +6453,12 @@
       <w:color w:val="2F5496" w:themeColor="accent1" w:themeShade="BF"/>
     </w:rPr>
   </w:style>
-  <w:style w:type="character" w:default="1" w:styleId="DefaultParagraphFont">
+  <w:style w:type="character" w:default="1" w:styleId="Absatz-Standardschriftart">
     <w:name w:val="Default Paragraph Font"/>
     <w:uiPriority w:val="1"/>
     <w:unhideWhenUsed/>
   </w:style>
-  <w:style w:type="table" w:default="1" w:styleId="TableNormal">
+  <w:style w:type="table" w:default="1" w:styleId="NormaleTabelle">
     <w:name w:val="Normal Table"/>
     <w:uiPriority w:val="99"/>
     <w:semiHidden/>
@@ -6354,16 +6473,16 @@
       </w:tblCellMar>
     </w:tblPr>
   </w:style>
-  <w:style w:type="numbering" w:default="1" w:styleId="NoList">
+  <w:style w:type="numbering" w:default="1" w:styleId="KeineListe">
     <w:name w:val="No List"/>
     <w:uiPriority w:val="99"/>
     <w:semiHidden/>
     <w:unhideWhenUsed/>
   </w:style>
-  <w:style w:type="character" w:customStyle="1" w:styleId="Heading2Char">
-    <w:name w:val="Heading 2 Char"/>
-    <w:basedOn w:val="DefaultParagraphFont"/>
-    <w:link w:val="Heading2"/>
+  <w:style w:type="character" w:customStyle="1" w:styleId="berschrift2Zchn">
+    <w:name w:val="Überschrift 2 Zchn"/>
+    <w:basedOn w:val="Absatz-Standardschriftart"/>
+    <w:link w:val="berschrift2"/>
     <w:uiPriority w:val="9"/>
     <w:rsid w:val="003E7538"/>
     <w:rPr>
@@ -6373,10 +6492,10 @@
       <w:szCs w:val="26"/>
     </w:rPr>
   </w:style>
-  <w:style w:type="character" w:customStyle="1" w:styleId="Heading3Char">
-    <w:name w:val="Heading 3 Char"/>
-    <w:basedOn w:val="DefaultParagraphFont"/>
-    <w:link w:val="Heading3"/>
+  <w:style w:type="character" w:customStyle="1" w:styleId="berschrift3Zchn">
+    <w:name w:val="Überschrift 3 Zchn"/>
+    <w:basedOn w:val="Absatz-Standardschriftart"/>
+    <w:link w:val="berschrift3"/>
     <w:uiPriority w:val="9"/>
     <w:rsid w:val="003E7538"/>
     <w:rPr>
@@ -6386,10 +6505,10 @@
       <w:szCs w:val="24"/>
     </w:rPr>
   </w:style>
-  <w:style w:type="character" w:customStyle="1" w:styleId="Heading4Char">
-    <w:name w:val="Heading 4 Char"/>
-    <w:basedOn w:val="DefaultParagraphFont"/>
-    <w:link w:val="Heading4"/>
+  <w:style w:type="character" w:customStyle="1" w:styleId="berschrift4Zchn">
+    <w:name w:val="Überschrift 4 Zchn"/>
+    <w:basedOn w:val="Absatz-Standardschriftart"/>
+    <w:link w:val="berschrift4"/>
     <w:uiPriority w:val="9"/>
     <w:rsid w:val="003E7538"/>
     <w:rPr>
@@ -6401,7 +6520,7 @@
   </w:style>
   <w:style w:type="character" w:styleId="HTMLCode">
     <w:name w:val="HTML Code"/>
-    <w:basedOn w:val="DefaultParagraphFont"/>
+    <w:basedOn w:val="Absatz-Standardschriftart"/>
     <w:uiPriority w:val="99"/>
     <w:semiHidden/>
     <w:unhideWhenUsed/>
@@ -6412,10 +6531,10 @@
       <w:szCs w:val="20"/>
     </w:rPr>
   </w:style>
-  <w:style w:type="paragraph" w:styleId="HTMLPreformatted">
+  <w:style w:type="paragraph" w:styleId="HTMLVorformatiert">
     <w:name w:val="HTML Preformatted"/>
-    <w:basedOn w:val="Normal"/>
-    <w:link w:val="HTMLPreformattedChar"/>
+    <w:basedOn w:val="Standard"/>
+    <w:link w:val="HTMLVorformatiertZchn"/>
     <w:uiPriority w:val="99"/>
     <w:semiHidden/>
     <w:unhideWhenUsed/>
@@ -6448,10 +6567,10 @@
       <w:lang w:eastAsia="de-DE"/>
     </w:rPr>
   </w:style>
-  <w:style w:type="character" w:customStyle="1" w:styleId="HTMLPreformattedChar">
-    <w:name w:val="HTML Preformatted Char"/>
-    <w:basedOn w:val="DefaultParagraphFont"/>
-    <w:link w:val="HTMLPreformatted"/>
+  <w:style w:type="character" w:customStyle="1" w:styleId="HTMLVorformatiertZchn">
+    <w:name w:val="HTML Vorformatiert Zchn"/>
+    <w:basedOn w:val="Absatz-Standardschriftart"/>
+    <w:link w:val="HTMLVorformatiert"/>
     <w:uiPriority w:val="99"/>
     <w:semiHidden/>
     <w:rsid w:val="003E7538"/>
@@ -6464,12 +6583,12 @@
   </w:style>
   <w:style w:type="character" w:customStyle="1" w:styleId="hljs-builtin">
     <w:name w:val="hljs-built_in"/>
-    <w:basedOn w:val="DefaultParagraphFont"/>
+    <w:basedOn w:val="Absatz-Standardschriftart"/>
     <w:rsid w:val="003E7538"/>
   </w:style>
-  <w:style w:type="character" w:styleId="Strong">
+  <w:style w:type="character" w:styleId="Fett">
     <w:name w:val="Strong"/>
-    <w:basedOn w:val="DefaultParagraphFont"/>
+    <w:basedOn w:val="Absatz-Standardschriftart"/>
     <w:uiPriority w:val="22"/>
     <w:qFormat/>
     <w:rsid w:val="003E7538"/>
@@ -6478,9 +6597,9 @@
       <w:bCs/>
     </w:rPr>
   </w:style>
-  <w:style w:type="paragraph" w:styleId="NormalWeb">
+  <w:style w:type="paragraph" w:styleId="StandardWeb">
     <w:name w:val="Normal (Web)"/>
-    <w:basedOn w:val="Normal"/>
+    <w:basedOn w:val="Standard"/>
     <w:uiPriority w:val="99"/>
     <w:unhideWhenUsed/>
     <w:rsid w:val="00546E32"/>
@@ -6494,10 +6613,10 @@
       <w:lang w:eastAsia="de-DE"/>
     </w:rPr>
   </w:style>
-  <w:style w:type="paragraph" w:styleId="Header">
+  <w:style w:type="paragraph" w:styleId="Kopfzeile">
     <w:name w:val="header"/>
-    <w:basedOn w:val="Normal"/>
-    <w:link w:val="HeaderChar"/>
+    <w:basedOn w:val="Standard"/>
+    <w:link w:val="KopfzeileZchn"/>
     <w:uiPriority w:val="99"/>
     <w:unhideWhenUsed/>
     <w:rsid w:val="006C16CB"/>
@@ -6509,17 +6628,17 @@
       <w:spacing w:after="0" w:line="240" w:lineRule="auto"/>
     </w:pPr>
   </w:style>
-  <w:style w:type="character" w:customStyle="1" w:styleId="HeaderChar">
-    <w:name w:val="Header Char"/>
-    <w:basedOn w:val="DefaultParagraphFont"/>
-    <w:link w:val="Header"/>
+  <w:style w:type="character" w:customStyle="1" w:styleId="KopfzeileZchn">
+    <w:name w:val="Kopfzeile Zchn"/>
+    <w:basedOn w:val="Absatz-Standardschriftart"/>
+    <w:link w:val="Kopfzeile"/>
     <w:uiPriority w:val="99"/>
     <w:rsid w:val="006C16CB"/>
   </w:style>
-  <w:style w:type="paragraph" w:styleId="Footer">
+  <w:style w:type="paragraph" w:styleId="Fuzeile">
     <w:name w:val="footer"/>
-    <w:basedOn w:val="Normal"/>
-    <w:link w:val="FooterChar"/>
+    <w:basedOn w:val="Standard"/>
+    <w:link w:val="FuzeileZchn"/>
     <w:uiPriority w:val="99"/>
     <w:unhideWhenUsed/>
     <w:rsid w:val="006C16CB"/>
@@ -6531,16 +6650,16 @@
       <w:spacing w:after="0" w:line="240" w:lineRule="auto"/>
     </w:pPr>
   </w:style>
-  <w:style w:type="character" w:customStyle="1" w:styleId="FooterChar">
-    <w:name w:val="Footer Char"/>
-    <w:basedOn w:val="DefaultParagraphFont"/>
-    <w:link w:val="Footer"/>
+  <w:style w:type="character" w:customStyle="1" w:styleId="FuzeileZchn">
+    <w:name w:val="Fußzeile Zchn"/>
+    <w:basedOn w:val="Absatz-Standardschriftart"/>
+    <w:link w:val="Fuzeile"/>
     <w:uiPriority w:val="99"/>
     <w:rsid w:val="006C16CB"/>
   </w:style>
-  <w:style w:type="table" w:styleId="TableGrid">
+  <w:style w:type="table" w:styleId="Tabellenraster">
     <w:name w:val="Table Grid"/>
-    <w:basedOn w:val="TableNormal"/>
+    <w:basedOn w:val="NormaleTabelle"/>
     <w:uiPriority w:val="39"/>
     <w:rsid w:val="004A3383"/>
     <w:pPr>
@@ -6559,7 +6678,7 @@
   </w:style>
   <w:style w:type="character" w:styleId="Hyperlink">
     <w:name w:val="Hyperlink"/>
-    <w:basedOn w:val="DefaultParagraphFont"/>
+    <w:basedOn w:val="Absatz-Standardschriftart"/>
     <w:uiPriority w:val="99"/>
     <w:unhideWhenUsed/>
     <w:rsid w:val="00817C08"/>
@@ -6568,9 +6687,9 @@
       <w:u w:val="single"/>
     </w:rPr>
   </w:style>
-  <w:style w:type="character" w:styleId="UnresolvedMention">
+  <w:style w:type="character" w:styleId="NichtaufgelsteErwhnung">
     <w:name w:val="Unresolved Mention"/>
-    <w:basedOn w:val="DefaultParagraphFont"/>
+    <w:basedOn w:val="Absatz-Standardschriftart"/>
     <w:uiPriority w:val="99"/>
     <w:semiHidden/>
     <w:unhideWhenUsed/>
@@ -6580,9 +6699,9 @@
       <w:shd w:val="clear" w:color="auto" w:fill="E1DFDD"/>
     </w:rPr>
   </w:style>
-  <w:style w:type="character" w:styleId="FollowedHyperlink">
+  <w:style w:type="character" w:styleId="BesuchterLink">
     <w:name w:val="FollowedHyperlink"/>
-    <w:basedOn w:val="DefaultParagraphFont"/>
+    <w:basedOn w:val="Absatz-Standardschriftart"/>
     <w:uiPriority w:val="99"/>
     <w:semiHidden/>
     <w:unhideWhenUsed/>
@@ -6592,9 +6711,9 @@
       <w:u w:val="single"/>
     </w:rPr>
   </w:style>
-  <w:style w:type="paragraph" w:styleId="ListParagraph">
+  <w:style w:type="paragraph" w:styleId="Listenabsatz">
     <w:name w:val="List Paragraph"/>
-    <w:basedOn w:val="Normal"/>
+    <w:basedOn w:val="Standard"/>
     <w:uiPriority w:val="34"/>
     <w:qFormat/>
     <w:rsid w:val="0037402D"/>

</xml_diff>